<commit_message>
docs: update final report docx
</commit_message>
<xml_diff>
--- a/ระบบแจ้งซ่อม3_Final.docx
+++ b/ระบบแจ้งซ่อม3_Final.docx
@@ -24644,7 +24644,7 @@
         <w:pStyle w:val="af6"/>
         <w:jc w:val="center"/>
         <w:rPr>
-          <w:rFonts w:ascii="TH Sarabun New" w:hAnsi="TH Sarabun New" w:cs="TH Sarabun New" w:hint="cs"/>
+          <w:rFonts w:ascii="TH Sarabun New" w:hAnsi="TH Sarabun New" w:cs="TH Sarabun New"/>
           <w:color w:val="auto"/>
           <w:sz w:val="20"/>
           <w:szCs w:val="20"/>
@@ -24753,7 +24753,7 @@
     <w:p>
       <w:pPr>
         <w:rPr>
-          <w:rFonts w:ascii="TH Sarabun New" w:hAnsi="TH Sarabun New" w:cs="TH Sarabun New" w:hint="cs"/>
+          <w:rFonts w:ascii="TH Sarabun New" w:hAnsi="TH Sarabun New" w:cs="TH Sarabun New"/>
           <w:sz w:val="32"/>
           <w:szCs w:val="32"/>
         </w:rPr>
@@ -25709,6 +25709,7 @@
       <w:r>
         <w:rPr>
           <w:rFonts w:ascii="TH Sarabun New" w:hAnsi="TH Sarabun New" w:cs="TH Sarabun New"/>
+          <w:noProof/>
           <w:sz w:val="32"/>
           <w:szCs w:val="32"/>
         </w:rPr>
@@ -27078,16 +27079,7 @@
           <w:szCs w:val="32"/>
           <w:cs/>
         </w:rPr>
-        <w:t>ก</w:t>
-      </w:r>
-      <w:r>
-        <w:rPr>
-          <w:rFonts w:ascii="TH Sarabun New" w:hAnsi="TH Sarabun New" w:cs="TH Sarabun New"/>
-          <w:sz w:val="32"/>
-          <w:szCs w:val="32"/>
-          <w:cs/>
-        </w:rPr>
-        <w:t>ลุ่มผู้จัดทำได้พัฒนา</w:t>
+        <w:t>กลุ่มผู้จัดทำได้พัฒนา</w:t>
       </w:r>
       <w:r>
         <w:rPr>
@@ -27293,14 +27285,12 @@
           <w:ilvl w:val="0"/>
           <w:numId w:val="17"/>
         </w:numPr>
-        <w:jc w:val="thaiDistribute"/>
-        <w:rPr>
-          <w:rFonts w:ascii="TH Sarabun New" w:hAnsi="TH Sarabun New" w:cs="TH Sarabun New"/>
-          <w:sz w:val="32"/>
-          <w:szCs w:val="32"/>
-        </w:rPr>
-      </w:pPr>
-      <w:proofErr w:type="spellStart"/>
+        <w:rPr>
+          <w:rFonts w:ascii="TH Sarabun New" w:hAnsi="TH Sarabun New" w:cs="TH Sarabun New"/>
+          <w:sz w:val="32"/>
+          <w:szCs w:val="32"/>
+        </w:rPr>
+      </w:pPr>
       <w:r>
         <w:rPr>
           <w:rFonts w:ascii="TH Sarabun New" w:hAnsi="TH Sarabun New" w:cs="TH Sarabun New"/>
@@ -27315,24 +27305,26 @@
           <w:sz w:val="32"/>
           <w:szCs w:val="32"/>
         </w:rPr>
+        <w:t>r</w:t>
+      </w:r>
+      <w:r>
+        <w:rPr>
+          <w:rFonts w:ascii="TH Sarabun New" w:hAnsi="TH Sarabun New" w:cs="TH Sarabun New"/>
+          <w:sz w:val="32"/>
+          <w:szCs w:val="32"/>
+        </w:rPr>
         <w:t>ototype</w:t>
       </w:r>
-      <w:proofErr w:type="spellEnd"/>
-      <w:r>
-        <w:rPr>
-          <w:rFonts w:ascii="TH Sarabun New" w:hAnsi="TH Sarabun New" w:cs="TH Sarabun New"/>
-          <w:sz w:val="32"/>
-          <w:szCs w:val="32"/>
-        </w:rPr>
-        <w:t>:</w:t>
-      </w:r>
-      <w:r>
-        <w:rPr>
-          <w:rFonts w:ascii="TH Sarabun New" w:hAnsi="TH Sarabun New" w:cs="TH Sarabun New"/>
-          <w:sz w:val="32"/>
-          <w:szCs w:val="32"/>
-        </w:rPr>
+      <w:r>
         <w:t xml:space="preserve"> </w:t>
+      </w:r>
+      <w:r>
+        <w:rPr>
+          <w:rFonts w:ascii="TH Sarabun New" w:hAnsi="TH Sarabun New" w:cs="TH Sarabun New"/>
+          <w:sz w:val="32"/>
+          <w:szCs w:val="32"/>
+        </w:rPr>
+        <w:t xml:space="preserve">Source: </w:t>
       </w:r>
       <w:hyperlink r:id="rId19" w:history="1">
         <w:r>
@@ -27345,42 +27337,46 @@
           <w:t>https://github.com/apiraSJ/SAD.git</w:t>
         </w:r>
       </w:hyperlink>
-    </w:p>
-    <w:p>
-      <w:pPr>
-        <w:pStyle w:val="af1"/>
-        <w:numPr>
-          <w:ilvl w:val="0"/>
-          <w:numId w:val="17"/>
-        </w:numPr>
-        <w:jc w:val="thaiDistribute"/>
-        <w:rPr>
-          <w:rFonts w:ascii="TH Sarabun New" w:hAnsi="TH Sarabun New" w:cs="TH Sarabun New"/>
-          <w:sz w:val="32"/>
-          <w:szCs w:val="32"/>
-        </w:rPr>
-      </w:pPr>
-      <w:r>
-        <w:rPr>
-          <w:rFonts w:ascii="TH Sarabun New" w:hAnsi="TH Sarabun New" w:cs="TH Sarabun New"/>
-          <w:sz w:val="32"/>
-          <w:szCs w:val="32"/>
-        </w:rPr>
-        <w:t>D</w:t>
-      </w:r>
-      <w:r>
-        <w:rPr>
-          <w:rFonts w:ascii="TH Sarabun New" w:hAnsi="TH Sarabun New" w:cs="TH Sarabun New"/>
-          <w:sz w:val="32"/>
-          <w:szCs w:val="32"/>
-        </w:rPr>
-        <w:t>esign</w:t>
-      </w:r>
-      <w:r>
-        <w:rPr>
-          <w:rFonts w:ascii="TH Sarabun New" w:hAnsi="TH Sarabun New" w:cs="TH Sarabun New"/>
-          <w:sz w:val="32"/>
-          <w:szCs w:val="32"/>
+      <w:r>
+        <w:rPr>
+          <w:rFonts w:ascii="TH Sarabun New" w:hAnsi="TH Sarabun New" w:cs="TH Sarabun New"/>
+          <w:sz w:val="32"/>
+          <w:szCs w:val="32"/>
+        </w:rPr>
+        <w:t xml:space="preserve"> </w:t>
+      </w:r>
+      <w:r>
+        <w:rPr>
+          <w:rFonts w:ascii="TH Sarabun New" w:hAnsi="TH Sarabun New" w:cs="TH Sarabun New"/>
+          <w:sz w:val="32"/>
+          <w:szCs w:val="32"/>
+        </w:rPr>
+        <w:br/>
+      </w:r>
+      <w:r>
+        <w:rPr>
+          <w:rFonts w:ascii="TH Sarabun New" w:hAnsi="TH Sarabun New" w:cs="TH Sarabun New"/>
+          <w:sz w:val="32"/>
+          <w:szCs w:val="32"/>
+          <w:cs/>
+        </w:rPr>
+        <w:t>ทดลองใช้งาน</w:t>
+      </w:r>
+      <w:r>
+        <w:rPr>
+          <w:rFonts w:ascii="TH Sarabun New" w:hAnsi="TH Sarabun New" w:cs="TH Sarabun New" w:hint="cs"/>
+          <w:sz w:val="32"/>
+          <w:szCs w:val="32"/>
+          <w:cs/>
+        </w:rPr>
+        <w:t>ที่นี้</w:t>
+      </w:r>
+      <w:r>
+        <w:rPr>
+          <w:rFonts w:ascii="TH Sarabun New" w:hAnsi="TH Sarabun New" w:cs="TH Sarabun New"/>
+          <w:sz w:val="32"/>
+          <w:szCs w:val="32"/>
+          <w:cs/>
         </w:rPr>
         <w:t>:</w:t>
       </w:r>
@@ -27400,8 +27396,49 @@
             <w:sz w:val="32"/>
             <w:szCs w:val="32"/>
           </w:rPr>
-          <w:t>https://www.figma.com/proto/DjZnDmzas6ewoMb1lFenMe/Untitled?node-id=1-2059&amp;p=</w:t>
+          <w:t>https://apirasj.github.io/SAD</w:t>
         </w:r>
+      </w:hyperlink>
+    </w:p>
+    <w:p>
+      <w:pPr>
+        <w:pStyle w:val="af1"/>
+        <w:numPr>
+          <w:ilvl w:val="0"/>
+          <w:numId w:val="17"/>
+        </w:numPr>
+        <w:jc w:val="both"/>
+        <w:rPr>
+          <w:rFonts w:ascii="TH Sarabun New" w:hAnsi="TH Sarabun New" w:cs="TH Sarabun New"/>
+          <w:sz w:val="32"/>
+          <w:szCs w:val="32"/>
+        </w:rPr>
+      </w:pPr>
+      <w:r>
+        <w:rPr>
+          <w:rFonts w:ascii="TH Sarabun New" w:hAnsi="TH Sarabun New" w:cs="TH Sarabun New"/>
+          <w:sz w:val="32"/>
+          <w:szCs w:val="32"/>
+        </w:rPr>
+        <w:t>D</w:t>
+      </w:r>
+      <w:r>
+        <w:rPr>
+          <w:rFonts w:ascii="TH Sarabun New" w:hAnsi="TH Sarabun New" w:cs="TH Sarabun New"/>
+          <w:sz w:val="32"/>
+          <w:szCs w:val="32"/>
+        </w:rPr>
+        <w:t>esign</w:t>
+      </w:r>
+      <w:r>
+        <w:rPr>
+          <w:rFonts w:ascii="TH Sarabun New" w:hAnsi="TH Sarabun New" w:cs="TH Sarabun New"/>
+          <w:sz w:val="32"/>
+          <w:szCs w:val="32"/>
+        </w:rPr>
+        <w:t xml:space="preserve">: </w:t>
+      </w:r>
+      <w:hyperlink r:id="rId21" w:history="1">
         <w:r>
           <w:rPr>
             <w:rStyle w:val="af2"/>
@@ -27409,16 +27446,7 @@
             <w:sz w:val="32"/>
             <w:szCs w:val="32"/>
           </w:rPr>
-          <w:t>f</w:t>
-        </w:r>
-        <w:r>
-          <w:rPr>
-            <w:rStyle w:val="af2"/>
-            <w:rFonts w:ascii="TH Sarabun New" w:hAnsi="TH Sarabun New" w:cs="TH Sarabun New"/>
-            <w:sz w:val="32"/>
-            <w:szCs w:val="32"/>
-          </w:rPr>
-          <w:t>&amp;t=6mnJP0c2m778uJkt-1&amp;scaling=scale-down&amp;content-scaling=fixed&amp;page-id=0%3A1&amp;starting-point-node-id=1%3A2059</w:t>
+          <w:t>https://www.figma.com/proto/DjZnDmzas6ewoMb1lFenMe/Untitled?timeline=keyframe&amp;node-id=202-101&amp;t=KK9nbe0lqhiuUNhR-0&amp;scaling=scale-down&amp;content-scaling=fixed&amp;page-id=8%3A9&amp;starting-point-node-id=202%3A101</w:t>
         </w:r>
       </w:hyperlink>
     </w:p>
@@ -27822,17 +27850,6 @@
         </w:rPr>
         <w:t xml:space="preserve"> </w:t>
       </w:r>
-    </w:p>
-    <w:p>
-      <w:pPr>
-        <w:ind w:left="360"/>
-        <w:jc w:val="thaiDistribute"/>
-        <w:rPr>
-          <w:rFonts w:ascii="TH Sarabun New" w:hAnsi="TH Sarabun New" w:cs="TH Sarabun New"/>
-          <w:sz w:val="32"/>
-          <w:szCs w:val="32"/>
-        </w:rPr>
-      </w:pPr>
     </w:p>
     <w:p>
       <w:pPr>
@@ -29293,7 +29310,7 @@
       <w:pPr>
         <w:jc w:val="thaiDistribute"/>
         <w:rPr>
-          <w:rFonts w:ascii="TH Sarabun New" w:hAnsi="TH Sarabun New" w:cs="TH Sarabun New" w:hint="cs"/>
+          <w:rFonts w:ascii="TH Sarabun New" w:hAnsi="TH Sarabun New" w:cs="TH Sarabun New"/>
           <w:sz w:val="32"/>
           <w:szCs w:val="32"/>
         </w:rPr>
@@ -29304,6 +29321,16 @@
         <w:jc w:val="thaiDistribute"/>
         <w:rPr>
           <w:rFonts w:ascii="TH Sarabun New" w:hAnsi="TH Sarabun New" w:cs="TH Sarabun New"/>
+          <w:sz w:val="32"/>
+          <w:szCs w:val="32"/>
+        </w:rPr>
+      </w:pPr>
+    </w:p>
+    <w:p>
+      <w:pPr>
+        <w:jc w:val="thaiDistribute"/>
+        <w:rPr>
+          <w:rFonts w:ascii="TH Sarabun New" w:hAnsi="TH Sarabun New" w:cs="TH Sarabun New"/>
           <w:b/>
           <w:bCs/>
           <w:sz w:val="32"/>
@@ -29318,6 +29345,7 @@
           <w:sz w:val="32"/>
           <w:szCs w:val="32"/>
         </w:rPr>
+        <w:lastRenderedPageBreak/>
         <w:t>User-Involving Modifications (</w:t>
       </w:r>
       <w:r>
@@ -29349,7 +29377,6 @@
           <w:szCs w:val="32"/>
           <w:cs/>
         </w:rPr>
-        <w:lastRenderedPageBreak/>
         <w:t>นำความคิดเห็นและข้อเสนอแนะจาก นักเรียนนายเรืออากาศ ผู้ดูแลอาคาร ช่าง และผู้บังคับบัญชา มาปรับปรุงระบบปัจจุบัน เช่น แบบฟอร์มแจ้งซ่อม การตรวจสอบและมอบหมายงาน การบันทึกผลการซ่อม การติดตามสถานะ และการแสดงรายงาน เพื่อให้การใช้งานสอดคล้องกับความต้องการของผู้ใช้มากยิ่งขึ้น</w:t>
       </w:r>
     </w:p>
@@ -31513,7 +31540,7 @@
         <w:rFonts w:ascii="Angsana New" w:eastAsiaTheme="minorHAnsi" w:hAnsi="Angsana New" w:cs="Angsana New" w:hint="default"/>
       </w:rPr>
     </w:lvl>
-    <w:lvl w:ilvl="1" w:tplc="04090003" w:tentative="1">
+    <w:lvl w:ilvl="1" w:tplc="04090003">
       <w:start w:val="1"/>
       <w:numFmt w:val="bullet"/>
       <w:lvlText w:val="o"/>

</xml_diff>